<commit_message>
Refine cathode ray tube diagram with textbook graphics and recompile exams
</commit_message>
<xml_diff>
--- a/San_Pham/De_Kiem_Tra_Hoa_10_Ma101.docx
+++ b/San_Pham/De_Kiem_Tra_Hoa_10_Ma101.docx
@@ -917,7 +917,7 @@
       <w:r>
         <w:drawing>
           <wp:inline xmlns:a="http://schemas.openxmlformats.org/drawingml/2006/main" xmlns:pic="http://schemas.openxmlformats.org/drawingml/2006/picture">
-            <wp:extent cx="694372" cy="228600"/>
+            <wp:extent cx="587829" cy="228600"/>
             <wp:docPr id="1" name="Picture 1"/>
             <wp:cNvGraphicFramePr>
               <a:graphicFrameLocks noChangeAspect="1"/>
@@ -938,7 +938,7 @@
                   <pic:spPr>
                     <a:xfrm>
                       <a:off x="0" y="0"/>
-                      <a:ext cx="694372" cy="228600"/>
+                      <a:ext cx="587829" cy="228600"/>
                     </a:xfrm>
                     <a:prstGeom prst="rect"/>
                   </pic:spPr>
@@ -963,7 +963,7 @@
       <w:r>
         <w:drawing>
           <wp:inline xmlns:a="http://schemas.openxmlformats.org/drawingml/2006/main" xmlns:pic="http://schemas.openxmlformats.org/drawingml/2006/picture">
-            <wp:extent cx="296636" cy="228600"/>
+            <wp:extent cx="228600" cy="228600"/>
             <wp:docPr id="2" name="Picture 2"/>
             <wp:cNvGraphicFramePr>
               <a:graphicFrameLocks noChangeAspect="1"/>
@@ -984,7 +984,7 @@
                   <pic:spPr>
                     <a:xfrm>
                       <a:off x="0" y="0"/>
-                      <a:ext cx="296636" cy="228600"/>
+                      <a:ext cx="228600" cy="228600"/>
                     </a:xfrm>
                     <a:prstGeom prst="rect"/>
                   </pic:spPr>
@@ -1009,7 +1009,7 @@
       <w:r>
         <w:drawing>
           <wp:inline xmlns:a="http://schemas.openxmlformats.org/drawingml/2006/main" xmlns:pic="http://schemas.openxmlformats.org/drawingml/2006/picture">
-            <wp:extent cx="762952" cy="228600"/>
+            <wp:extent cx="587829" cy="228600"/>
             <wp:docPr id="3" name="Picture 3"/>
             <wp:cNvGraphicFramePr>
               <a:graphicFrameLocks noChangeAspect="1"/>
@@ -1030,7 +1030,7 @@
                   <pic:spPr>
                     <a:xfrm>
                       <a:off x="0" y="0"/>
-                      <a:ext cx="762952" cy="228600"/>
+                      <a:ext cx="587829" cy="228600"/>
                     </a:xfrm>
                     <a:prstGeom prst="rect"/>
                   </pic:spPr>
@@ -1055,7 +1055,7 @@
       <w:r>
         <w:drawing>
           <wp:inline xmlns:a="http://schemas.openxmlformats.org/drawingml/2006/main" xmlns:pic="http://schemas.openxmlformats.org/drawingml/2006/picture">
-            <wp:extent cx="754380" cy="228600"/>
+            <wp:extent cx="587829" cy="228600"/>
             <wp:docPr id="4" name="Picture 4"/>
             <wp:cNvGraphicFramePr>
               <a:graphicFrameLocks noChangeAspect="1"/>
@@ -1076,7 +1076,7 @@
                   <pic:spPr>
                     <a:xfrm>
                       <a:off x="0" y="0"/>
-                      <a:ext cx="754380" cy="228600"/>
+                      <a:ext cx="587829" cy="228600"/>
                     </a:xfrm>
                     <a:prstGeom prst="rect"/>
                   </pic:spPr>
@@ -2101,7 +2101,7 @@
       <w:r>
         <w:drawing>
           <wp:inline xmlns:a="http://schemas.openxmlformats.org/drawingml/2006/main" xmlns:pic="http://schemas.openxmlformats.org/drawingml/2006/picture">
-            <wp:extent cx="3960000" cy="2105265"/>
+            <wp:extent cx="3960000" cy="2257664"/>
             <wp:docPr id="5" name="Picture 5"/>
             <wp:cNvGraphicFramePr>
               <a:graphicFrameLocks noChangeAspect="1"/>
@@ -2122,7 +2122,7 @@
                   <pic:spPr>
                     <a:xfrm>
                       <a:off x="0" y="0"/>
-                      <a:ext cx="3960000" cy="2105265"/>
+                      <a:ext cx="3960000" cy="2257664"/>
                     </a:xfrm>
                     <a:prstGeom prst="rect"/>
                   </pic:spPr>

</xml_diff>